<commit_message>
Completar el inciso d con la velocidad medida en el video
Cuatro vueltas completas medidas cuadro por cuadro: 43.42 ± 1.03 rpm
(U95), s = 0.65 rpm, CV = 1.5 %. Informe, Excel y LEEME actualizados.

Co-Authored-By: Claude Opus 5.5 <noreply@anthropic.com>
Claude-Session: https://claude.ai/code/session_01WP57Dyk8ur5DUJREvDsmBX
</commit_message>
<xml_diff>
--- a/Mecanismo/Proyecto 2 - Entrega final/1_Informe/Informe_Segundo_Parcial_Dosificador.docx
+++ b/Mecanismo/Proyecto 2 - Entrega final/1_Informe/Informe_Segundo_Parcial_Dosificador.docx
@@ -3815,20 +3815,12 @@
       <w:r>
         <w:rPr>
           <w:rFonts w:ascii="Arial" w:cs="Arial" w:eastAsia="Arial" w:hAnsi="Arial"/>
-          <w:sz w:val="22"/>
-          <w:szCs w:val="22"/>
-        </w:rPr>
-        <w:t xml:space="preserve">Este inciso se mide sobre el modelo físico. Las tres mediciones (o más) se escriben en la hoja </w:t>
-      </w:r>
-      <w:r>
-        <w:rPr>
-          <w:rFonts w:ascii="Arial" w:cs="Arial" w:eastAsia="Arial" w:hAnsi="Arial"/>
           <w:b/>
           <w:bCs/>
           <w:sz w:val="22"/>
           <w:szCs w:val="22"/>
         </w:rPr>
-        <w:t xml:space="preserve">P2 g) Contraste</w:t>
+        <w:t xml:space="preserve">Instrumento y método. </w:t>
       </w:r>
       <w:r>
         <w:rPr>
@@ -3836,23 +3828,7 @@
           <w:sz w:val="22"/>
           <w:szCs w:val="22"/>
         </w:rPr>
-        <w:t xml:space="preserve"> del Excel y en la variable </w:t>
-      </w:r>
-      <w:r>
-        <w:rPr>
-          <w:rFonts w:ascii="Consolas" w:cs="Consolas" w:eastAsia="Consolas" w:hAnsi="Consolas"/>
-          <w:sz w:val="22"/>
-          <w:szCs w:val="22"/>
-        </w:rPr>
-        <w:t xml:space="preserve">rpm_medidas</w:t>
-      </w:r>
-      <w:r>
-        <w:rPr>
-          <w:rFonts w:ascii="Arial" w:cs="Arial" w:eastAsia="Arial" w:hAnsi="Arial"/>
-          <w:sz w:val="22"/>
-          <w:szCs w:val="22"/>
-        </w:rPr>
-        <w:t xml:space="preserve"> del script P2_2_Analisis_Validacion.m, que calculan el promedio, la desviación estándar y la incertidumbre del promedio al 95 % (U₉₅ = t·s/√N, con t = 4.303 para N = 3).</w:t>
+        <w:t xml:space="preserve">La velocidad del motor se midió por análisis de video cuadro por cuadro: el modelo se grabó funcionando con carga (celular a 30 cuadros por segundo) y se siguió el pasador A de la manivela en cada cuadro (sección 9.2). Cada medición es el tiempo T que tarda la manivela en dar una vuelta completa, obtenido al interpolar el instante en que el ángulo de A vuelve a pasar por el mismo valor; la velocidad es n = 60/T. Medir vueltas completas hace que el resultado no dependa de la escala ni de la perspectiva de la cámara.</w:t>
       </w:r>
     </w:p>
     <w:p>
@@ -3894,10 +3870,11 @@
         </w:tblBorders>
       </w:tblPr>
       <w:tblGrid>
+        <w:gridCol w:w="1500"/>
+        <w:gridCol w:w="2860"/>
+        <w:gridCol w:w="1500"/>
         <w:gridCol w:w="1700"/>
-        <w:gridCol w:w="3000"/>
-        <w:gridCol w:w="2160"/>
-        <w:gridCol w:w="2500"/>
+        <w:gridCol w:w="1800"/>
       </w:tblGrid>
       <w:tr>
         <w:trPr>
@@ -3905,7 +3882,7 @@
         </w:trPr>
         <w:tc>
           <w:tcPr>
-            <w:tcW w:type="dxa" w:w="1700"/>
+            <w:tcW w:type="dxa" w:w="1500"/>
             <w:tcBorders>
               <w:top w:val="single" w:color="BFBFBF" w:sz="4"/>
               <w:left w:val="single" w:color="BFBFBF" w:sz="4"/>
@@ -3939,7 +3916,7 @@
         </w:tc>
         <w:tc>
           <w:tcPr>
-            <w:tcW w:type="dxa" w:w="3000"/>
+            <w:tcW w:type="dxa" w:w="2860"/>
             <w:tcBorders>
               <w:top w:val="single" w:color="BFBFBF" w:sz="4"/>
               <w:left w:val="single" w:color="BFBFBF" w:sz="4"/>
@@ -3973,7 +3950,7 @@
         </w:tc>
         <w:tc>
           <w:tcPr>
-            <w:tcW w:type="dxa" w:w="2160"/>
+            <w:tcW w:type="dxa" w:w="1500"/>
             <w:tcBorders>
               <w:top w:val="single" w:color="BFBFBF" w:sz="4"/>
               <w:left w:val="single" w:color="BFBFBF" w:sz="4"/>
@@ -4001,13 +3978,13 @@
                 <w:sz w:val="18"/>
                 <w:szCs w:val="18"/>
               </w:rPr>
-              <w:t xml:space="preserve">n (rpm)</w:t>
-            </w:r>
-          </w:p>
-        </w:tc>
-        <w:tc>
-          <w:tcPr>
-            <w:tcW w:type="dxa" w:w="2500"/>
+              <w:t xml:space="preserve">Periodo T (s)</w:t>
+            </w:r>
+          </w:p>
+        </w:tc>
+        <w:tc>
+          <w:tcPr>
+            <w:tcW w:type="dxa" w:w="1700"/>
             <w:tcBorders>
               <w:top w:val="single" w:color="BFBFBF" w:sz="4"/>
               <w:left w:val="single" w:color="BFBFBF" w:sz="4"/>
@@ -4035,6 +4012,40 @@
                 <w:sz w:val="18"/>
                 <w:szCs w:val="18"/>
               </w:rPr>
+              <w:t xml:space="preserve">n = 60/T (rpm)</w:t>
+            </w:r>
+          </w:p>
+        </w:tc>
+        <w:tc>
+          <w:tcPr>
+            <w:tcW w:type="dxa" w:w="1800"/>
+            <w:tcBorders>
+              <w:top w:val="single" w:color="BFBFBF" w:sz="4"/>
+              <w:left w:val="single" w:color="BFBFBF" w:sz="4"/>
+              <w:bottom w:val="single" w:color="BFBFBF" w:sz="4"/>
+              <w:right w:val="single" w:color="BFBFBF" w:sz="4"/>
+            </w:tcBorders>
+            <w:shd w:fill="D9E1F2" w:color="auto" w:val="clear"/>
+            <w:tcMar>
+              <w:top w:type="dxa" w:w="50"/>
+              <w:left w:type="dxa" w:w="80"/>
+              <w:bottom w:type="dxa" w:w="50"/>
+              <w:right w:type="dxa" w:w="80"/>
+            </w:tcMar>
+            <w:vAlign w:val="center"/>
+          </w:tcPr>
+          <w:p>
+            <w:pPr>
+              <w:jc w:val="center"/>
+            </w:pPr>
+            <w:r>
+              <w:rPr>
+                <w:rFonts w:ascii="Arial" w:cs="Arial" w:eastAsia="Arial" w:hAnsi="Arial"/>
+                <w:b/>
+                <w:bCs/>
+                <w:sz w:val="18"/>
+                <w:szCs w:val="18"/>
+              </w:rPr>
               <w:t xml:space="preserve">Condición</w:t>
             </w:r>
           </w:p>
@@ -4043,6 +4054,105 @@
       <w:tr>
         <w:tc>
           <w:tcPr>
+            <w:tcW w:type="dxa" w:w="1500"/>
+            <w:tcBorders>
+              <w:top w:val="single" w:color="BFBFBF" w:sz="4"/>
+              <w:left w:val="single" w:color="BFBFBF" w:sz="4"/>
+              <w:bottom w:val="single" w:color="BFBFBF" w:sz="4"/>
+              <w:right w:val="single" w:color="BFBFBF" w:sz="4"/>
+            </w:tcBorders>
+            <w:tcMar>
+              <w:top w:type="dxa" w:w="50"/>
+              <w:left w:type="dxa" w:w="80"/>
+              <w:bottom w:type="dxa" w:w="50"/>
+              <w:right w:type="dxa" w:w="80"/>
+            </w:tcMar>
+            <w:vAlign w:val="center"/>
+          </w:tcPr>
+          <w:p>
+            <w:pPr>
+              <w:jc w:val="left"/>
+            </w:pPr>
+            <w:r>
+              <w:rPr>
+                <w:rFonts w:ascii="Arial" w:cs="Arial" w:eastAsia="Arial" w:hAnsi="Arial"/>
+                <w:b w:val="false"/>
+                <w:bCs w:val="false"/>
+                <w:sz w:val="18"/>
+                <w:szCs w:val="18"/>
+              </w:rPr>
+              <w:t xml:space="preserve">1</w:t>
+            </w:r>
+          </w:p>
+        </w:tc>
+        <w:tc>
+          <w:tcPr>
+            <w:tcW w:type="dxa" w:w="2860"/>
+            <w:tcBorders>
+              <w:top w:val="single" w:color="BFBFBF" w:sz="4"/>
+              <w:left w:val="single" w:color="BFBFBF" w:sz="4"/>
+              <w:bottom w:val="single" w:color="BFBFBF" w:sz="4"/>
+              <w:right w:val="single" w:color="BFBFBF" w:sz="4"/>
+            </w:tcBorders>
+            <w:tcMar>
+              <w:top w:type="dxa" w:w="50"/>
+              <w:left w:type="dxa" w:w="80"/>
+              <w:bottom w:type="dxa" w:w="50"/>
+              <w:right w:type="dxa" w:w="80"/>
+            </w:tcMar>
+            <w:vAlign w:val="center"/>
+          </w:tcPr>
+          <w:p>
+            <w:pPr>
+              <w:jc w:val="left"/>
+            </w:pPr>
+            <w:r>
+              <w:rPr>
+                <w:rFonts w:ascii="Arial" w:cs="Arial" w:eastAsia="Arial" w:hAnsi="Arial"/>
+                <w:b w:val="false"/>
+                <w:bCs w:val="false"/>
+                <w:sz w:val="18"/>
+                <w:szCs w:val="18"/>
+              </w:rPr>
+              <w:t xml:space="preserve">Video 30 fps, cuadro por cuadro</w:t>
+            </w:r>
+          </w:p>
+        </w:tc>
+        <w:tc>
+          <w:tcPr>
+            <w:tcW w:type="dxa" w:w="1500"/>
+            <w:tcBorders>
+              <w:top w:val="single" w:color="BFBFBF" w:sz="4"/>
+              <w:left w:val="single" w:color="BFBFBF" w:sz="4"/>
+              <w:bottom w:val="single" w:color="BFBFBF" w:sz="4"/>
+              <w:right w:val="single" w:color="BFBFBF" w:sz="4"/>
+            </w:tcBorders>
+            <w:tcMar>
+              <w:top w:type="dxa" w:w="50"/>
+              <w:left w:type="dxa" w:w="80"/>
+              <w:bottom w:type="dxa" w:w="50"/>
+              <w:right w:type="dxa" w:w="80"/>
+            </w:tcMar>
+            <w:vAlign w:val="center"/>
+          </w:tcPr>
+          <w:p>
+            <w:pPr>
+              <w:jc w:val="center"/>
+            </w:pPr>
+            <w:r>
+              <w:rPr>
+                <w:rFonts w:ascii="Arial" w:cs="Arial" w:eastAsia="Arial" w:hAnsi="Arial"/>
+                <w:b w:val="false"/>
+                <w:bCs w:val="false"/>
+                <w:sz w:val="18"/>
+                <w:szCs w:val="18"/>
+              </w:rPr>
+              <w:t xml:space="preserve">1.3705</w:t>
+            </w:r>
+          </w:p>
+        </w:tc>
+        <w:tc>
+          <w:tcPr>
             <w:tcW w:type="dxa" w:w="1700"/>
             <w:tcBorders>
               <w:top w:val="single" w:color="BFBFBF" w:sz="4"/>
@@ -4070,30 +4180,566 @@
                 <w:sz w:val="18"/>
                 <w:szCs w:val="18"/>
               </w:rPr>
-              <w:t xml:space="preserve">1</w:t>
-            </w:r>
-          </w:p>
-        </w:tc>
-        <w:tc>
-          <w:tcPr>
-            <w:tcW w:type="dxa" w:w="3000"/>
-            <w:tcBorders>
-              <w:top w:val="single" w:color="BFBFBF" w:sz="4"/>
-              <w:left w:val="single" w:color="BFBFBF" w:sz="4"/>
-              <w:bottom w:val="single" w:color="BFBFBF" w:sz="4"/>
-              <w:right w:val="single" w:color="BFBFBF" w:sz="4"/>
-            </w:tcBorders>
-            <w:tcMar>
-              <w:top w:type="dxa" w:w="50"/>
-              <w:left w:type="dxa" w:w="80"/>
-              <w:bottom w:type="dxa" w:w="50"/>
-              <w:right w:type="dxa" w:w="80"/>
-            </w:tcMar>
-            <w:vAlign w:val="center"/>
-          </w:tcPr>
-          <w:p>
-            <w:pPr>
-              <w:jc w:val="center"/>
+              <w:t xml:space="preserve">43.78</w:t>
+            </w:r>
+          </w:p>
+        </w:tc>
+        <w:tc>
+          <w:tcPr>
+            <w:tcW w:type="dxa" w:w="1800"/>
+            <w:tcBorders>
+              <w:top w:val="single" w:color="BFBFBF" w:sz="4"/>
+              <w:left w:val="single" w:color="BFBFBF" w:sz="4"/>
+              <w:bottom w:val="single" w:color="BFBFBF" w:sz="4"/>
+              <w:right w:val="single" w:color="BFBFBF" w:sz="4"/>
+            </w:tcBorders>
+            <w:tcMar>
+              <w:top w:type="dxa" w:w="50"/>
+              <w:left w:type="dxa" w:w="80"/>
+              <w:bottom w:type="dxa" w:w="50"/>
+              <w:right w:type="dxa" w:w="80"/>
+            </w:tcMar>
+            <w:vAlign w:val="center"/>
+          </w:tcPr>
+          <w:p>
+            <w:pPr>
+              <w:jc w:val="center"/>
+            </w:pPr>
+            <w:r>
+              <w:rPr>
+                <w:rFonts w:ascii="Arial" w:cs="Arial" w:eastAsia="Arial" w:hAnsi="Arial"/>
+                <w:b w:val="false"/>
+                <w:bCs w:val="false"/>
+                <w:sz w:val="18"/>
+                <w:szCs w:val="18"/>
+              </w:rPr>
+              <w:t xml:space="preserve">con carga, vuelta 1</w:t>
+            </w:r>
+          </w:p>
+        </w:tc>
+      </w:tr>
+      <w:tr>
+        <w:tc>
+          <w:tcPr>
+            <w:tcW w:type="dxa" w:w="1500"/>
+            <w:tcBorders>
+              <w:top w:val="single" w:color="BFBFBF" w:sz="4"/>
+              <w:left w:val="single" w:color="BFBFBF" w:sz="4"/>
+              <w:bottom w:val="single" w:color="BFBFBF" w:sz="4"/>
+              <w:right w:val="single" w:color="BFBFBF" w:sz="4"/>
+            </w:tcBorders>
+            <w:tcMar>
+              <w:top w:type="dxa" w:w="50"/>
+              <w:left w:type="dxa" w:w="80"/>
+              <w:bottom w:type="dxa" w:w="50"/>
+              <w:right w:type="dxa" w:w="80"/>
+            </w:tcMar>
+            <w:vAlign w:val="center"/>
+          </w:tcPr>
+          <w:p>
+            <w:pPr>
+              <w:jc w:val="left"/>
+            </w:pPr>
+            <w:r>
+              <w:rPr>
+                <w:rFonts w:ascii="Arial" w:cs="Arial" w:eastAsia="Arial" w:hAnsi="Arial"/>
+                <w:b w:val="false"/>
+                <w:bCs w:val="false"/>
+                <w:sz w:val="18"/>
+                <w:szCs w:val="18"/>
+              </w:rPr>
+              <w:t xml:space="preserve">2</w:t>
+            </w:r>
+          </w:p>
+        </w:tc>
+        <w:tc>
+          <w:tcPr>
+            <w:tcW w:type="dxa" w:w="2860"/>
+            <w:tcBorders>
+              <w:top w:val="single" w:color="BFBFBF" w:sz="4"/>
+              <w:left w:val="single" w:color="BFBFBF" w:sz="4"/>
+              <w:bottom w:val="single" w:color="BFBFBF" w:sz="4"/>
+              <w:right w:val="single" w:color="BFBFBF" w:sz="4"/>
+            </w:tcBorders>
+            <w:tcMar>
+              <w:top w:type="dxa" w:w="50"/>
+              <w:left w:type="dxa" w:w="80"/>
+              <w:bottom w:type="dxa" w:w="50"/>
+              <w:right w:type="dxa" w:w="80"/>
+            </w:tcMar>
+            <w:vAlign w:val="center"/>
+          </w:tcPr>
+          <w:p>
+            <w:pPr>
+              <w:jc w:val="left"/>
+            </w:pPr>
+            <w:r>
+              <w:rPr>
+                <w:rFonts w:ascii="Arial" w:cs="Arial" w:eastAsia="Arial" w:hAnsi="Arial"/>
+                <w:b w:val="false"/>
+                <w:bCs w:val="false"/>
+                <w:sz w:val="18"/>
+                <w:szCs w:val="18"/>
+              </w:rPr>
+              <w:t xml:space="preserve">Video 30 fps, cuadro por cuadro</w:t>
+            </w:r>
+          </w:p>
+        </w:tc>
+        <w:tc>
+          <w:tcPr>
+            <w:tcW w:type="dxa" w:w="1500"/>
+            <w:tcBorders>
+              <w:top w:val="single" w:color="BFBFBF" w:sz="4"/>
+              <w:left w:val="single" w:color="BFBFBF" w:sz="4"/>
+              <w:bottom w:val="single" w:color="BFBFBF" w:sz="4"/>
+              <w:right w:val="single" w:color="BFBFBF" w:sz="4"/>
+            </w:tcBorders>
+            <w:tcMar>
+              <w:top w:type="dxa" w:w="50"/>
+              <w:left w:type="dxa" w:w="80"/>
+              <w:bottom w:type="dxa" w:w="50"/>
+              <w:right w:type="dxa" w:w="80"/>
+            </w:tcMar>
+            <w:vAlign w:val="center"/>
+          </w:tcPr>
+          <w:p>
+            <w:pPr>
+              <w:jc w:val="center"/>
+            </w:pPr>
+            <w:r>
+              <w:rPr>
+                <w:rFonts w:ascii="Arial" w:cs="Arial" w:eastAsia="Arial" w:hAnsi="Arial"/>
+                <w:b w:val="false"/>
+                <w:bCs w:val="false"/>
+                <w:sz w:val="18"/>
+                <w:szCs w:val="18"/>
+              </w:rPr>
+              <w:t xml:space="preserve">1.3917</w:t>
+            </w:r>
+          </w:p>
+        </w:tc>
+        <w:tc>
+          <w:tcPr>
+            <w:tcW w:type="dxa" w:w="1700"/>
+            <w:tcBorders>
+              <w:top w:val="single" w:color="BFBFBF" w:sz="4"/>
+              <w:left w:val="single" w:color="BFBFBF" w:sz="4"/>
+              <w:bottom w:val="single" w:color="BFBFBF" w:sz="4"/>
+              <w:right w:val="single" w:color="BFBFBF" w:sz="4"/>
+            </w:tcBorders>
+            <w:tcMar>
+              <w:top w:type="dxa" w:w="50"/>
+              <w:left w:type="dxa" w:w="80"/>
+              <w:bottom w:type="dxa" w:w="50"/>
+              <w:right w:type="dxa" w:w="80"/>
+            </w:tcMar>
+            <w:vAlign w:val="center"/>
+          </w:tcPr>
+          <w:p>
+            <w:pPr>
+              <w:jc w:val="center"/>
+            </w:pPr>
+            <w:r>
+              <w:rPr>
+                <w:rFonts w:ascii="Arial" w:cs="Arial" w:eastAsia="Arial" w:hAnsi="Arial"/>
+                <w:b w:val="false"/>
+                <w:bCs w:val="false"/>
+                <w:sz w:val="18"/>
+                <w:szCs w:val="18"/>
+              </w:rPr>
+              <w:t xml:space="preserve">43.11</w:t>
+            </w:r>
+          </w:p>
+        </w:tc>
+        <w:tc>
+          <w:tcPr>
+            <w:tcW w:type="dxa" w:w="1800"/>
+            <w:tcBorders>
+              <w:top w:val="single" w:color="BFBFBF" w:sz="4"/>
+              <w:left w:val="single" w:color="BFBFBF" w:sz="4"/>
+              <w:bottom w:val="single" w:color="BFBFBF" w:sz="4"/>
+              <w:right w:val="single" w:color="BFBFBF" w:sz="4"/>
+            </w:tcBorders>
+            <w:tcMar>
+              <w:top w:type="dxa" w:w="50"/>
+              <w:left w:type="dxa" w:w="80"/>
+              <w:bottom w:type="dxa" w:w="50"/>
+              <w:right w:type="dxa" w:w="80"/>
+            </w:tcMar>
+            <w:vAlign w:val="center"/>
+          </w:tcPr>
+          <w:p>
+            <w:pPr>
+              <w:jc w:val="center"/>
+            </w:pPr>
+            <w:r>
+              <w:rPr>
+                <w:rFonts w:ascii="Arial" w:cs="Arial" w:eastAsia="Arial" w:hAnsi="Arial"/>
+                <w:b w:val="false"/>
+                <w:bCs w:val="false"/>
+                <w:sz w:val="18"/>
+                <w:szCs w:val="18"/>
+              </w:rPr>
+              <w:t xml:space="preserve">con carga, vuelta 2</w:t>
+            </w:r>
+          </w:p>
+        </w:tc>
+      </w:tr>
+      <w:tr>
+        <w:tc>
+          <w:tcPr>
+            <w:tcW w:type="dxa" w:w="1500"/>
+            <w:tcBorders>
+              <w:top w:val="single" w:color="BFBFBF" w:sz="4"/>
+              <w:left w:val="single" w:color="BFBFBF" w:sz="4"/>
+              <w:bottom w:val="single" w:color="BFBFBF" w:sz="4"/>
+              <w:right w:val="single" w:color="BFBFBF" w:sz="4"/>
+            </w:tcBorders>
+            <w:tcMar>
+              <w:top w:type="dxa" w:w="50"/>
+              <w:left w:type="dxa" w:w="80"/>
+              <w:bottom w:type="dxa" w:w="50"/>
+              <w:right w:type="dxa" w:w="80"/>
+            </w:tcMar>
+            <w:vAlign w:val="center"/>
+          </w:tcPr>
+          <w:p>
+            <w:pPr>
+              <w:jc w:val="left"/>
+            </w:pPr>
+            <w:r>
+              <w:rPr>
+                <w:rFonts w:ascii="Arial" w:cs="Arial" w:eastAsia="Arial" w:hAnsi="Arial"/>
+                <w:b w:val="false"/>
+                <w:bCs w:val="false"/>
+                <w:sz w:val="18"/>
+                <w:szCs w:val="18"/>
+              </w:rPr>
+              <w:t xml:space="preserve">3</w:t>
+            </w:r>
+          </w:p>
+        </w:tc>
+        <w:tc>
+          <w:tcPr>
+            <w:tcW w:type="dxa" w:w="2860"/>
+            <w:tcBorders>
+              <w:top w:val="single" w:color="BFBFBF" w:sz="4"/>
+              <w:left w:val="single" w:color="BFBFBF" w:sz="4"/>
+              <w:bottom w:val="single" w:color="BFBFBF" w:sz="4"/>
+              <w:right w:val="single" w:color="BFBFBF" w:sz="4"/>
+            </w:tcBorders>
+            <w:tcMar>
+              <w:top w:type="dxa" w:w="50"/>
+              <w:left w:type="dxa" w:w="80"/>
+              <w:bottom w:type="dxa" w:w="50"/>
+              <w:right w:type="dxa" w:w="80"/>
+            </w:tcMar>
+            <w:vAlign w:val="center"/>
+          </w:tcPr>
+          <w:p>
+            <w:pPr>
+              <w:jc w:val="left"/>
+            </w:pPr>
+            <w:r>
+              <w:rPr>
+                <w:rFonts w:ascii="Arial" w:cs="Arial" w:eastAsia="Arial" w:hAnsi="Arial"/>
+                <w:b w:val="false"/>
+                <w:bCs w:val="false"/>
+                <w:sz w:val="18"/>
+                <w:szCs w:val="18"/>
+              </w:rPr>
+              <w:t xml:space="preserve">Video 30 fps, cuadro por cuadro</w:t>
+            </w:r>
+          </w:p>
+        </w:tc>
+        <w:tc>
+          <w:tcPr>
+            <w:tcW w:type="dxa" w:w="1500"/>
+            <w:tcBorders>
+              <w:top w:val="single" w:color="BFBFBF" w:sz="4"/>
+              <w:left w:val="single" w:color="BFBFBF" w:sz="4"/>
+              <w:bottom w:val="single" w:color="BFBFBF" w:sz="4"/>
+              <w:right w:val="single" w:color="BFBFBF" w:sz="4"/>
+            </w:tcBorders>
+            <w:tcMar>
+              <w:top w:type="dxa" w:w="50"/>
+              <w:left w:type="dxa" w:w="80"/>
+              <w:bottom w:type="dxa" w:w="50"/>
+              <w:right w:type="dxa" w:w="80"/>
+            </w:tcMar>
+            <w:vAlign w:val="center"/>
+          </w:tcPr>
+          <w:p>
+            <w:pPr>
+              <w:jc w:val="center"/>
+            </w:pPr>
+            <w:r>
+              <w:rPr>
+                <w:rFonts w:ascii="Arial" w:cs="Arial" w:eastAsia="Arial" w:hAnsi="Arial"/>
+                <w:b w:val="false"/>
+                <w:bCs w:val="false"/>
+                <w:sz w:val="18"/>
+                <w:szCs w:val="18"/>
+              </w:rPr>
+              <w:t xml:space="preserve">1.3604</w:t>
+            </w:r>
+          </w:p>
+        </w:tc>
+        <w:tc>
+          <w:tcPr>
+            <w:tcW w:type="dxa" w:w="1700"/>
+            <w:tcBorders>
+              <w:top w:val="single" w:color="BFBFBF" w:sz="4"/>
+              <w:left w:val="single" w:color="BFBFBF" w:sz="4"/>
+              <w:bottom w:val="single" w:color="BFBFBF" w:sz="4"/>
+              <w:right w:val="single" w:color="BFBFBF" w:sz="4"/>
+            </w:tcBorders>
+            <w:tcMar>
+              <w:top w:type="dxa" w:w="50"/>
+              <w:left w:type="dxa" w:w="80"/>
+              <w:bottom w:type="dxa" w:w="50"/>
+              <w:right w:type="dxa" w:w="80"/>
+            </w:tcMar>
+            <w:vAlign w:val="center"/>
+          </w:tcPr>
+          <w:p>
+            <w:pPr>
+              <w:jc w:val="center"/>
+            </w:pPr>
+            <w:r>
+              <w:rPr>
+                <w:rFonts w:ascii="Arial" w:cs="Arial" w:eastAsia="Arial" w:hAnsi="Arial"/>
+                <w:b w:val="false"/>
+                <w:bCs w:val="false"/>
+                <w:sz w:val="18"/>
+                <w:szCs w:val="18"/>
+              </w:rPr>
+              <w:t xml:space="preserve">44.10</w:t>
+            </w:r>
+          </w:p>
+        </w:tc>
+        <w:tc>
+          <w:tcPr>
+            <w:tcW w:type="dxa" w:w="1800"/>
+            <w:tcBorders>
+              <w:top w:val="single" w:color="BFBFBF" w:sz="4"/>
+              <w:left w:val="single" w:color="BFBFBF" w:sz="4"/>
+              <w:bottom w:val="single" w:color="BFBFBF" w:sz="4"/>
+              <w:right w:val="single" w:color="BFBFBF" w:sz="4"/>
+            </w:tcBorders>
+            <w:tcMar>
+              <w:top w:type="dxa" w:w="50"/>
+              <w:left w:type="dxa" w:w="80"/>
+              <w:bottom w:type="dxa" w:w="50"/>
+              <w:right w:type="dxa" w:w="80"/>
+            </w:tcMar>
+            <w:vAlign w:val="center"/>
+          </w:tcPr>
+          <w:p>
+            <w:pPr>
+              <w:jc w:val="center"/>
+            </w:pPr>
+            <w:r>
+              <w:rPr>
+                <w:rFonts w:ascii="Arial" w:cs="Arial" w:eastAsia="Arial" w:hAnsi="Arial"/>
+                <w:b w:val="false"/>
+                <w:bCs w:val="false"/>
+                <w:sz w:val="18"/>
+                <w:szCs w:val="18"/>
+              </w:rPr>
+              <w:t xml:space="preserve">con carga, vuelta 3</w:t>
+            </w:r>
+          </w:p>
+        </w:tc>
+      </w:tr>
+      <w:tr>
+        <w:tc>
+          <w:tcPr>
+            <w:tcW w:type="dxa" w:w="1500"/>
+            <w:tcBorders>
+              <w:top w:val="single" w:color="BFBFBF" w:sz="4"/>
+              <w:left w:val="single" w:color="BFBFBF" w:sz="4"/>
+              <w:bottom w:val="single" w:color="BFBFBF" w:sz="4"/>
+              <w:right w:val="single" w:color="BFBFBF" w:sz="4"/>
+            </w:tcBorders>
+            <w:tcMar>
+              <w:top w:type="dxa" w:w="50"/>
+              <w:left w:type="dxa" w:w="80"/>
+              <w:bottom w:type="dxa" w:w="50"/>
+              <w:right w:type="dxa" w:w="80"/>
+            </w:tcMar>
+            <w:vAlign w:val="center"/>
+          </w:tcPr>
+          <w:p>
+            <w:pPr>
+              <w:jc w:val="left"/>
+            </w:pPr>
+            <w:r>
+              <w:rPr>
+                <w:rFonts w:ascii="Arial" w:cs="Arial" w:eastAsia="Arial" w:hAnsi="Arial"/>
+                <w:b w:val="false"/>
+                <w:bCs w:val="false"/>
+                <w:sz w:val="18"/>
+                <w:szCs w:val="18"/>
+              </w:rPr>
+              <w:t xml:space="preserve">4</w:t>
+            </w:r>
+          </w:p>
+        </w:tc>
+        <w:tc>
+          <w:tcPr>
+            <w:tcW w:type="dxa" w:w="2860"/>
+            <w:tcBorders>
+              <w:top w:val="single" w:color="BFBFBF" w:sz="4"/>
+              <w:left w:val="single" w:color="BFBFBF" w:sz="4"/>
+              <w:bottom w:val="single" w:color="BFBFBF" w:sz="4"/>
+              <w:right w:val="single" w:color="BFBFBF" w:sz="4"/>
+            </w:tcBorders>
+            <w:tcMar>
+              <w:top w:type="dxa" w:w="50"/>
+              <w:left w:type="dxa" w:w="80"/>
+              <w:bottom w:type="dxa" w:w="50"/>
+              <w:right w:type="dxa" w:w="80"/>
+            </w:tcMar>
+            <w:vAlign w:val="center"/>
+          </w:tcPr>
+          <w:p>
+            <w:pPr>
+              <w:jc w:val="left"/>
+            </w:pPr>
+            <w:r>
+              <w:rPr>
+                <w:rFonts w:ascii="Arial" w:cs="Arial" w:eastAsia="Arial" w:hAnsi="Arial"/>
+                <w:b w:val="false"/>
+                <w:bCs w:val="false"/>
+                <w:sz w:val="18"/>
+                <w:szCs w:val="18"/>
+              </w:rPr>
+              <w:t xml:space="preserve">Video 30 fps, cuadro por cuadro</w:t>
+            </w:r>
+          </w:p>
+        </w:tc>
+        <w:tc>
+          <w:tcPr>
+            <w:tcW w:type="dxa" w:w="1500"/>
+            <w:tcBorders>
+              <w:top w:val="single" w:color="BFBFBF" w:sz="4"/>
+              <w:left w:val="single" w:color="BFBFBF" w:sz="4"/>
+              <w:bottom w:val="single" w:color="BFBFBF" w:sz="4"/>
+              <w:right w:val="single" w:color="BFBFBF" w:sz="4"/>
+            </w:tcBorders>
+            <w:tcMar>
+              <w:top w:type="dxa" w:w="50"/>
+              <w:left w:type="dxa" w:w="80"/>
+              <w:bottom w:type="dxa" w:w="50"/>
+              <w:right w:type="dxa" w:w="80"/>
+            </w:tcMar>
+            <w:vAlign w:val="center"/>
+          </w:tcPr>
+          <w:p>
+            <w:pPr>
+              <w:jc w:val="center"/>
+            </w:pPr>
+            <w:r>
+              <w:rPr>
+                <w:rFonts w:ascii="Arial" w:cs="Arial" w:eastAsia="Arial" w:hAnsi="Arial"/>
+                <w:b w:val="false"/>
+                <w:bCs w:val="false"/>
+                <w:sz w:val="18"/>
+                <w:szCs w:val="18"/>
+              </w:rPr>
+              <w:t xml:space="preserve">1.4063</w:t>
+            </w:r>
+          </w:p>
+        </w:tc>
+        <w:tc>
+          <w:tcPr>
+            <w:tcW w:type="dxa" w:w="1700"/>
+            <w:tcBorders>
+              <w:top w:val="single" w:color="BFBFBF" w:sz="4"/>
+              <w:left w:val="single" w:color="BFBFBF" w:sz="4"/>
+              <w:bottom w:val="single" w:color="BFBFBF" w:sz="4"/>
+              <w:right w:val="single" w:color="BFBFBF" w:sz="4"/>
+            </w:tcBorders>
+            <w:tcMar>
+              <w:top w:type="dxa" w:w="50"/>
+              <w:left w:type="dxa" w:w="80"/>
+              <w:bottom w:type="dxa" w:w="50"/>
+              <w:right w:type="dxa" w:w="80"/>
+            </w:tcMar>
+            <w:vAlign w:val="center"/>
+          </w:tcPr>
+          <w:p>
+            <w:pPr>
+              <w:jc w:val="center"/>
+            </w:pPr>
+            <w:r>
+              <w:rPr>
+                <w:rFonts w:ascii="Arial" w:cs="Arial" w:eastAsia="Arial" w:hAnsi="Arial"/>
+                <w:b w:val="false"/>
+                <w:bCs w:val="false"/>
+                <w:sz w:val="18"/>
+                <w:szCs w:val="18"/>
+              </w:rPr>
+              <w:t xml:space="preserve">42.67</w:t>
+            </w:r>
+          </w:p>
+        </w:tc>
+        <w:tc>
+          <w:tcPr>
+            <w:tcW w:type="dxa" w:w="1800"/>
+            <w:tcBorders>
+              <w:top w:val="single" w:color="BFBFBF" w:sz="4"/>
+              <w:left w:val="single" w:color="BFBFBF" w:sz="4"/>
+              <w:bottom w:val="single" w:color="BFBFBF" w:sz="4"/>
+              <w:right w:val="single" w:color="BFBFBF" w:sz="4"/>
+            </w:tcBorders>
+            <w:tcMar>
+              <w:top w:type="dxa" w:w="50"/>
+              <w:left w:type="dxa" w:w="80"/>
+              <w:bottom w:type="dxa" w:w="50"/>
+              <w:right w:type="dxa" w:w="80"/>
+            </w:tcMar>
+            <w:vAlign w:val="center"/>
+          </w:tcPr>
+          <w:p>
+            <w:pPr>
+              <w:jc w:val="center"/>
+            </w:pPr>
+            <w:r>
+              <w:rPr>
+                <w:rFonts w:ascii="Arial" w:cs="Arial" w:eastAsia="Arial" w:hAnsi="Arial"/>
+                <w:b w:val="false"/>
+                <w:bCs w:val="false"/>
+                <w:sz w:val="18"/>
+                <w:szCs w:val="18"/>
+              </w:rPr>
+              <w:t xml:space="preserve">con carga, vuelta 4</w:t>
+            </w:r>
+          </w:p>
+        </w:tc>
+      </w:tr>
+      <w:tr>
+        <w:tc>
+          <w:tcPr>
+            <w:tcW w:type="dxa" w:w="1500"/>
+            <w:tcBorders>
+              <w:top w:val="single" w:color="BFBFBF" w:sz="4"/>
+              <w:left w:val="single" w:color="BFBFBF" w:sz="4"/>
+              <w:bottom w:val="single" w:color="BFBFBF" w:sz="4"/>
+              <w:right w:val="single" w:color="BFBFBF" w:sz="4"/>
+            </w:tcBorders>
+            <w:tcMar>
+              <w:top w:type="dxa" w:w="50"/>
+              <w:left w:type="dxa" w:w="80"/>
+              <w:bottom w:type="dxa" w:w="50"/>
+              <w:right w:type="dxa" w:w="80"/>
+            </w:tcMar>
+            <w:vAlign w:val="center"/>
+          </w:tcPr>
+          <w:p>
+            <w:pPr>
+              <w:jc w:val="left"/>
             </w:pPr>
             <w:r>
               <w:rPr>
@@ -4102,15 +4748,80 @@
                 <w:bCs/>
                 <w:sz w:val="18"/>
                 <w:szCs w:val="18"/>
-                <w:highlight w:val="yellow"/>
-              </w:rPr>
-              <w:t xml:space="preserve">[COMPLETAR: ]</w:t>
-            </w:r>
-          </w:p>
-        </w:tc>
-        <w:tc>
-          <w:tcPr>
-            <w:tcW w:type="dxa" w:w="2160"/>
+              </w:rPr>
+              <w:t xml:space="preserve">Promedio</w:t>
+            </w:r>
+          </w:p>
+        </w:tc>
+        <w:tc>
+          <w:tcPr>
+            <w:tcW w:type="dxa" w:w="2860"/>
+            <w:tcBorders>
+              <w:top w:val="single" w:color="BFBFBF" w:sz="4"/>
+              <w:left w:val="single" w:color="BFBFBF" w:sz="4"/>
+              <w:bottom w:val="single" w:color="BFBFBF" w:sz="4"/>
+              <w:right w:val="single" w:color="BFBFBF" w:sz="4"/>
+            </w:tcBorders>
+            <w:tcMar>
+              <w:top w:type="dxa" w:w="50"/>
+              <w:left w:type="dxa" w:w="80"/>
+              <w:bottom w:type="dxa" w:w="50"/>
+              <w:right w:type="dxa" w:w="80"/>
+            </w:tcMar>
+            <w:vAlign w:val="center"/>
+          </w:tcPr>
+          <w:p>
+            <w:pPr>
+              <w:jc w:val="left"/>
+            </w:pPr>
+            <w:r>
+              <w:rPr>
+                <w:rFonts w:ascii="Arial" w:cs="Arial" w:eastAsia="Arial" w:hAnsi="Arial"/>
+                <w:b w:val="false"/>
+                <w:bCs w:val="false"/>
+                <w:sz w:val="18"/>
+                <w:szCs w:val="18"/>
+              </w:rPr>
+              <w:t xml:space="preserve">—</w:t>
+            </w:r>
+          </w:p>
+        </w:tc>
+        <w:tc>
+          <w:tcPr>
+            <w:tcW w:type="dxa" w:w="1500"/>
+            <w:tcBorders>
+              <w:top w:val="single" w:color="BFBFBF" w:sz="4"/>
+              <w:left w:val="single" w:color="BFBFBF" w:sz="4"/>
+              <w:bottom w:val="single" w:color="BFBFBF" w:sz="4"/>
+              <w:right w:val="single" w:color="BFBFBF" w:sz="4"/>
+            </w:tcBorders>
+            <w:tcMar>
+              <w:top w:type="dxa" w:w="50"/>
+              <w:left w:type="dxa" w:w="80"/>
+              <w:bottom w:type="dxa" w:w="50"/>
+              <w:right w:type="dxa" w:w="80"/>
+            </w:tcMar>
+            <w:vAlign w:val="center"/>
+          </w:tcPr>
+          <w:p>
+            <w:pPr>
+              <w:jc w:val="center"/>
+            </w:pPr>
+            <w:r>
+              <w:rPr>
+                <w:rFonts w:ascii="Arial" w:cs="Arial" w:eastAsia="Arial" w:hAnsi="Arial"/>
+                <w:b w:val="false"/>
+                <w:bCs w:val="false"/>
+                <w:sz w:val="18"/>
+                <w:szCs w:val="18"/>
+              </w:rPr>
+              <w:t xml:space="preserve">1.3820</w:t>
+            </w:r>
+          </w:p>
+        </w:tc>
+        <w:tc>
+          <w:tcPr>
+            <w:tcW w:type="dxa" w:w="1700"/>
             <w:tcBorders>
               <w:top w:val="single" w:color="BFBFBF" w:sz="4"/>
               <w:left w:val="single" w:color="BFBFBF" w:sz="4"/>
@@ -4136,32 +4847,233 @@
                 <w:bCs/>
                 <w:sz w:val="18"/>
                 <w:szCs w:val="18"/>
-                <w:highlight w:val="yellow"/>
-              </w:rPr>
-              <w:t xml:space="preserve">[COMPLETAR: ]</w:t>
-            </w:r>
-          </w:p>
-        </w:tc>
-        <w:tc>
-          <w:tcPr>
-            <w:tcW w:type="dxa" w:w="2500"/>
-            <w:tcBorders>
-              <w:top w:val="single" w:color="BFBFBF" w:sz="4"/>
-              <w:left w:val="single" w:color="BFBFBF" w:sz="4"/>
-              <w:bottom w:val="single" w:color="BFBFBF" w:sz="4"/>
-              <w:right w:val="single" w:color="BFBFBF" w:sz="4"/>
-            </w:tcBorders>
-            <w:tcMar>
-              <w:top w:type="dxa" w:w="50"/>
-              <w:left w:type="dxa" w:w="80"/>
-              <w:bottom w:type="dxa" w:w="50"/>
-              <w:right w:type="dxa" w:w="80"/>
-            </w:tcMar>
-            <w:vAlign w:val="center"/>
-          </w:tcPr>
-          <w:p>
-            <w:pPr>
-              <w:jc w:val="center"/>
+              </w:rPr>
+              <w:t xml:space="preserve">43.42</w:t>
+            </w:r>
+          </w:p>
+        </w:tc>
+        <w:tc>
+          <w:tcPr>
+            <w:tcW w:type="dxa" w:w="1800"/>
+            <w:tcBorders>
+              <w:top w:val="single" w:color="BFBFBF" w:sz="4"/>
+              <w:left w:val="single" w:color="BFBFBF" w:sz="4"/>
+              <w:bottom w:val="single" w:color="BFBFBF" w:sz="4"/>
+              <w:right w:val="single" w:color="BFBFBF" w:sz="4"/>
+            </w:tcBorders>
+            <w:tcMar>
+              <w:top w:type="dxa" w:w="50"/>
+              <w:left w:type="dxa" w:w="80"/>
+              <w:bottom w:type="dxa" w:w="50"/>
+              <w:right w:type="dxa" w:w="80"/>
+            </w:tcMar>
+            <w:vAlign w:val="center"/>
+          </w:tcPr>
+          <w:p>
+            <w:pPr>
+              <w:jc w:val="center"/>
+            </w:pPr>
+            <w:r>
+              <w:rPr>
+                <w:rFonts w:ascii="Arial" w:cs="Arial" w:eastAsia="Arial" w:hAnsi="Arial"/>
+                <w:b w:val="false"/>
+                <w:bCs w:val="false"/>
+                <w:sz w:val="18"/>
+                <w:szCs w:val="18"/>
+              </w:rPr>
+              <w:t xml:space="preserve">N = 4</w:t>
+            </w:r>
+          </w:p>
+        </w:tc>
+      </w:tr>
+      <w:tr>
+        <w:tc>
+          <w:tcPr>
+            <w:tcW w:type="dxa" w:w="1500"/>
+            <w:tcBorders>
+              <w:top w:val="single" w:color="BFBFBF" w:sz="4"/>
+              <w:left w:val="single" w:color="BFBFBF" w:sz="4"/>
+              <w:bottom w:val="single" w:color="BFBFBF" w:sz="4"/>
+              <w:right w:val="single" w:color="BFBFBF" w:sz="4"/>
+            </w:tcBorders>
+            <w:tcMar>
+              <w:top w:type="dxa" w:w="50"/>
+              <w:left w:type="dxa" w:w="80"/>
+              <w:bottom w:type="dxa" w:w="50"/>
+              <w:right w:type="dxa" w:w="80"/>
+            </w:tcMar>
+            <w:vAlign w:val="center"/>
+          </w:tcPr>
+          <w:p>
+            <w:pPr>
+              <w:jc w:val="left"/>
+            </w:pPr>
+            <w:r>
+              <w:rPr>
+                <w:rFonts w:ascii="Arial" w:cs="Arial" w:eastAsia="Arial" w:hAnsi="Arial"/>
+                <w:b w:val="false"/>
+                <w:bCs w:val="false"/>
+                <w:sz w:val="18"/>
+                <w:szCs w:val="18"/>
+              </w:rPr>
+              <w:t xml:space="preserve">Desviación estándar s</w:t>
+            </w:r>
+          </w:p>
+        </w:tc>
+        <w:tc>
+          <w:tcPr>
+            <w:tcW w:type="dxa" w:w="2860"/>
+            <w:tcBorders>
+              <w:top w:val="single" w:color="BFBFBF" w:sz="4"/>
+              <w:left w:val="single" w:color="BFBFBF" w:sz="4"/>
+              <w:bottom w:val="single" w:color="BFBFBF" w:sz="4"/>
+              <w:right w:val="single" w:color="BFBFBF" w:sz="4"/>
+            </w:tcBorders>
+            <w:tcMar>
+              <w:top w:type="dxa" w:w="50"/>
+              <w:left w:type="dxa" w:w="80"/>
+              <w:bottom w:type="dxa" w:w="50"/>
+              <w:right w:type="dxa" w:w="80"/>
+            </w:tcMar>
+            <w:vAlign w:val="center"/>
+          </w:tcPr>
+          <w:p>
+            <w:pPr>
+              <w:jc w:val="left"/>
+            </w:pPr>
+            <w:r>
+              <w:rPr>
+                <w:rFonts w:ascii="Arial" w:cs="Arial" w:eastAsia="Arial" w:hAnsi="Arial"/>
+                <w:b w:val="false"/>
+                <w:bCs w:val="false"/>
+                <w:sz w:val="18"/>
+                <w:szCs w:val="18"/>
+              </w:rPr>
+              <w:t xml:space="preserve">—</w:t>
+            </w:r>
+          </w:p>
+        </w:tc>
+        <w:tc>
+          <w:tcPr>
+            <w:tcW w:type="dxa" w:w="1500"/>
+            <w:tcBorders>
+              <w:top w:val="single" w:color="BFBFBF" w:sz="4"/>
+              <w:left w:val="single" w:color="BFBFBF" w:sz="4"/>
+              <w:bottom w:val="single" w:color="BFBFBF" w:sz="4"/>
+              <w:right w:val="single" w:color="BFBFBF" w:sz="4"/>
+            </w:tcBorders>
+            <w:tcMar>
+              <w:top w:type="dxa" w:w="50"/>
+              <w:left w:type="dxa" w:w="80"/>
+              <w:bottom w:type="dxa" w:w="50"/>
+              <w:right w:type="dxa" w:w="80"/>
+            </w:tcMar>
+            <w:vAlign w:val="center"/>
+          </w:tcPr>
+          <w:p>
+            <w:pPr>
+              <w:jc w:val="center"/>
+            </w:pPr>
+            <w:r>
+              <w:rPr>
+                <w:rFonts w:ascii="Arial" w:cs="Arial" w:eastAsia="Arial" w:hAnsi="Arial"/>
+                <w:b w:val="false"/>
+                <w:bCs w:val="false"/>
+                <w:sz w:val="18"/>
+                <w:szCs w:val="18"/>
+              </w:rPr>
+              <w:t xml:space="preserve">—</w:t>
+            </w:r>
+          </w:p>
+        </w:tc>
+        <w:tc>
+          <w:tcPr>
+            <w:tcW w:type="dxa" w:w="1700"/>
+            <w:tcBorders>
+              <w:top w:val="single" w:color="BFBFBF" w:sz="4"/>
+              <w:left w:val="single" w:color="BFBFBF" w:sz="4"/>
+              <w:bottom w:val="single" w:color="BFBFBF" w:sz="4"/>
+              <w:right w:val="single" w:color="BFBFBF" w:sz="4"/>
+            </w:tcBorders>
+            <w:tcMar>
+              <w:top w:type="dxa" w:w="50"/>
+              <w:left w:type="dxa" w:w="80"/>
+              <w:bottom w:type="dxa" w:w="50"/>
+              <w:right w:type="dxa" w:w="80"/>
+            </w:tcMar>
+            <w:vAlign w:val="center"/>
+          </w:tcPr>
+          <w:p>
+            <w:pPr>
+              <w:jc w:val="center"/>
+            </w:pPr>
+            <w:r>
+              <w:rPr>
+                <w:rFonts w:ascii="Arial" w:cs="Arial" w:eastAsia="Arial" w:hAnsi="Arial"/>
+                <w:b w:val="false"/>
+                <w:bCs w:val="false"/>
+                <w:sz w:val="18"/>
+                <w:szCs w:val="18"/>
+              </w:rPr>
+              <w:t xml:space="preserve">0.649</w:t>
+            </w:r>
+          </w:p>
+        </w:tc>
+        <w:tc>
+          <w:tcPr>
+            <w:tcW w:type="dxa" w:w="1800"/>
+            <w:tcBorders>
+              <w:top w:val="single" w:color="BFBFBF" w:sz="4"/>
+              <w:left w:val="single" w:color="BFBFBF" w:sz="4"/>
+              <w:bottom w:val="single" w:color="BFBFBF" w:sz="4"/>
+              <w:right w:val="single" w:color="BFBFBF" w:sz="4"/>
+            </w:tcBorders>
+            <w:tcMar>
+              <w:top w:type="dxa" w:w="50"/>
+              <w:left w:type="dxa" w:w="80"/>
+              <w:bottom w:type="dxa" w:w="50"/>
+              <w:right w:type="dxa" w:w="80"/>
+            </w:tcMar>
+            <w:vAlign w:val="center"/>
+          </w:tcPr>
+          <w:p>
+            <w:pPr>
+              <w:jc w:val="center"/>
+            </w:pPr>
+            <w:r>
+              <w:rPr>
+                <w:rFonts w:ascii="Arial" w:cs="Arial" w:eastAsia="Arial" w:hAnsi="Arial"/>
+                <w:b w:val="false"/>
+                <w:bCs w:val="false"/>
+                <w:sz w:val="18"/>
+                <w:szCs w:val="18"/>
+              </w:rPr>
+              <w:t xml:space="preserve">CV = 1.49 %</w:t>
+            </w:r>
+          </w:p>
+        </w:tc>
+      </w:tr>
+      <w:tr>
+        <w:tc>
+          <w:tcPr>
+            <w:tcW w:type="dxa" w:w="1500"/>
+            <w:tcBorders>
+              <w:top w:val="single" w:color="BFBFBF" w:sz="4"/>
+              <w:left w:val="single" w:color="BFBFBF" w:sz="4"/>
+              <w:bottom w:val="single" w:color="BFBFBF" w:sz="4"/>
+              <w:right w:val="single" w:color="BFBFBF" w:sz="4"/>
+            </w:tcBorders>
+            <w:tcMar>
+              <w:top w:type="dxa" w:w="50"/>
+              <w:left w:type="dxa" w:w="80"/>
+              <w:bottom w:type="dxa" w:w="50"/>
+              <w:right w:type="dxa" w:w="80"/>
+            </w:tcMar>
+            <w:vAlign w:val="center"/>
+          </w:tcPr>
+          <w:p>
+            <w:pPr>
+              <w:jc w:val="left"/>
             </w:pPr>
             <w:r>
               <w:rPr>
@@ -4170,50 +5082,80 @@
                 <w:bCs/>
                 <w:sz w:val="18"/>
                 <w:szCs w:val="18"/>
-                <w:highlight w:val="yellow"/>
-              </w:rPr>
-              <w:t xml:space="preserve">[COMPLETAR: ]</w:t>
-            </w:r>
-          </w:p>
-        </w:tc>
-      </w:tr>
-      <w:tr>
+              </w:rPr>
+              <w:t xml:space="preserve">Promedio ± U₉₅</w:t>
+            </w:r>
+          </w:p>
+        </w:tc>
+        <w:tc>
+          <w:tcPr>
+            <w:tcW w:type="dxa" w:w="2860"/>
+            <w:tcBorders>
+              <w:top w:val="single" w:color="BFBFBF" w:sz="4"/>
+              <w:left w:val="single" w:color="BFBFBF" w:sz="4"/>
+              <w:bottom w:val="single" w:color="BFBFBF" w:sz="4"/>
+              <w:right w:val="single" w:color="BFBFBF" w:sz="4"/>
+            </w:tcBorders>
+            <w:tcMar>
+              <w:top w:type="dxa" w:w="50"/>
+              <w:left w:type="dxa" w:w="80"/>
+              <w:bottom w:type="dxa" w:w="50"/>
+              <w:right w:type="dxa" w:w="80"/>
+            </w:tcMar>
+            <w:vAlign w:val="center"/>
+          </w:tcPr>
+          <w:p>
+            <w:pPr>
+              <w:jc w:val="left"/>
+            </w:pPr>
+            <w:r>
+              <w:rPr>
+                <w:rFonts w:ascii="Arial" w:cs="Arial" w:eastAsia="Arial" w:hAnsi="Arial"/>
+                <w:b w:val="false"/>
+                <w:bCs w:val="false"/>
+                <w:sz w:val="18"/>
+                <w:szCs w:val="18"/>
+              </w:rPr>
+              <w:t xml:space="preserve">—</w:t>
+            </w:r>
+          </w:p>
+        </w:tc>
+        <w:tc>
+          <w:tcPr>
+            <w:tcW w:type="dxa" w:w="1500"/>
+            <w:tcBorders>
+              <w:top w:val="single" w:color="BFBFBF" w:sz="4"/>
+              <w:left w:val="single" w:color="BFBFBF" w:sz="4"/>
+              <w:bottom w:val="single" w:color="BFBFBF" w:sz="4"/>
+              <w:right w:val="single" w:color="BFBFBF" w:sz="4"/>
+            </w:tcBorders>
+            <w:tcMar>
+              <w:top w:type="dxa" w:w="50"/>
+              <w:left w:type="dxa" w:w="80"/>
+              <w:bottom w:type="dxa" w:w="50"/>
+              <w:right w:type="dxa" w:w="80"/>
+            </w:tcMar>
+            <w:vAlign w:val="center"/>
+          </w:tcPr>
+          <w:p>
+            <w:pPr>
+              <w:jc w:val="center"/>
+            </w:pPr>
+            <w:r>
+              <w:rPr>
+                <w:rFonts w:ascii="Arial" w:cs="Arial" w:eastAsia="Arial" w:hAnsi="Arial"/>
+                <w:b w:val="false"/>
+                <w:bCs w:val="false"/>
+                <w:sz w:val="18"/>
+                <w:szCs w:val="18"/>
+              </w:rPr>
+              <w:t xml:space="preserve">—</w:t>
+            </w:r>
+          </w:p>
+        </w:tc>
         <w:tc>
           <w:tcPr>
             <w:tcW w:type="dxa" w:w="1700"/>
-            <w:tcBorders>
-              <w:top w:val="single" w:color="BFBFBF" w:sz="4"/>
-              <w:left w:val="single" w:color="BFBFBF" w:sz="4"/>
-              <w:bottom w:val="single" w:color="BFBFBF" w:sz="4"/>
-              <w:right w:val="single" w:color="BFBFBF" w:sz="4"/>
-            </w:tcBorders>
-            <w:tcMar>
-              <w:top w:type="dxa" w:w="50"/>
-              <w:left w:type="dxa" w:w="80"/>
-              <w:bottom w:type="dxa" w:w="50"/>
-              <w:right w:type="dxa" w:w="80"/>
-            </w:tcMar>
-            <w:vAlign w:val="center"/>
-          </w:tcPr>
-          <w:p>
-            <w:pPr>
-              <w:jc w:val="center"/>
-            </w:pPr>
-            <w:r>
-              <w:rPr>
-                <w:rFonts w:ascii="Arial" w:cs="Arial" w:eastAsia="Arial" w:hAnsi="Arial"/>
-                <w:b w:val="false"/>
-                <w:bCs w:val="false"/>
-                <w:sz w:val="18"/>
-                <w:szCs w:val="18"/>
-              </w:rPr>
-              <w:t xml:space="preserve">2</w:t>
-            </w:r>
-          </w:p>
-        </w:tc>
-        <w:tc>
-          <w:tcPr>
-            <w:tcW w:type="dxa" w:w="3000"/>
             <w:tcBorders>
               <w:top w:val="single" w:color="BFBFBF" w:sz="4"/>
               <w:left w:val="single" w:color="BFBFBF" w:sz="4"/>
@@ -4239,349 +5181,41 @@
                 <w:bCs/>
                 <w:sz w:val="18"/>
                 <w:szCs w:val="18"/>
-                <w:highlight w:val="yellow"/>
-              </w:rPr>
-              <w:t xml:space="preserve">[COMPLETAR: ]</w:t>
-            </w:r>
-          </w:p>
-        </w:tc>
-        <w:tc>
-          <w:tcPr>
-            <w:tcW w:type="dxa" w:w="2160"/>
-            <w:tcBorders>
-              <w:top w:val="single" w:color="BFBFBF" w:sz="4"/>
-              <w:left w:val="single" w:color="BFBFBF" w:sz="4"/>
-              <w:bottom w:val="single" w:color="BFBFBF" w:sz="4"/>
-              <w:right w:val="single" w:color="BFBFBF" w:sz="4"/>
-            </w:tcBorders>
-            <w:tcMar>
-              <w:top w:type="dxa" w:w="50"/>
-              <w:left w:type="dxa" w:w="80"/>
-              <w:bottom w:type="dxa" w:w="50"/>
-              <w:right w:type="dxa" w:w="80"/>
-            </w:tcMar>
-            <w:vAlign w:val="center"/>
-          </w:tcPr>
-          <w:p>
-            <w:pPr>
-              <w:jc w:val="center"/>
-            </w:pPr>
-            <w:r>
-              <w:rPr>
-                <w:rFonts w:ascii="Arial" w:cs="Arial" w:eastAsia="Arial" w:hAnsi="Arial"/>
-                <w:b/>
-                <w:bCs/>
-                <w:sz w:val="18"/>
-                <w:szCs w:val="18"/>
-                <w:highlight w:val="yellow"/>
-              </w:rPr>
-              <w:t xml:space="preserve">[COMPLETAR: ]</w:t>
-            </w:r>
-          </w:p>
-        </w:tc>
-        <w:tc>
-          <w:tcPr>
-            <w:tcW w:type="dxa" w:w="2500"/>
-            <w:tcBorders>
-              <w:top w:val="single" w:color="BFBFBF" w:sz="4"/>
-              <w:left w:val="single" w:color="BFBFBF" w:sz="4"/>
-              <w:bottom w:val="single" w:color="BFBFBF" w:sz="4"/>
-              <w:right w:val="single" w:color="BFBFBF" w:sz="4"/>
-            </w:tcBorders>
-            <w:tcMar>
-              <w:top w:type="dxa" w:w="50"/>
-              <w:left w:type="dxa" w:w="80"/>
-              <w:bottom w:type="dxa" w:w="50"/>
-              <w:right w:type="dxa" w:w="80"/>
-            </w:tcMar>
-            <w:vAlign w:val="center"/>
-          </w:tcPr>
-          <w:p>
-            <w:pPr>
-              <w:jc w:val="center"/>
-            </w:pPr>
-            <w:r>
-              <w:rPr>
-                <w:rFonts w:ascii="Arial" w:cs="Arial" w:eastAsia="Arial" w:hAnsi="Arial"/>
-                <w:b/>
-                <w:bCs/>
-                <w:sz w:val="18"/>
-                <w:szCs w:val="18"/>
-                <w:highlight w:val="yellow"/>
-              </w:rPr>
-              <w:t xml:space="preserve">[COMPLETAR: ]</w:t>
-            </w:r>
-          </w:p>
-        </w:tc>
-      </w:tr>
-      <w:tr>
-        <w:tc>
-          <w:tcPr>
-            <w:tcW w:type="dxa" w:w="1700"/>
-            <w:tcBorders>
-              <w:top w:val="single" w:color="BFBFBF" w:sz="4"/>
-              <w:left w:val="single" w:color="BFBFBF" w:sz="4"/>
-              <w:bottom w:val="single" w:color="BFBFBF" w:sz="4"/>
-              <w:right w:val="single" w:color="BFBFBF" w:sz="4"/>
-            </w:tcBorders>
-            <w:tcMar>
-              <w:top w:type="dxa" w:w="50"/>
-              <w:left w:type="dxa" w:w="80"/>
-              <w:bottom w:type="dxa" w:w="50"/>
-              <w:right w:type="dxa" w:w="80"/>
-            </w:tcMar>
-            <w:vAlign w:val="center"/>
-          </w:tcPr>
-          <w:p>
-            <w:pPr>
-              <w:jc w:val="center"/>
-            </w:pPr>
-            <w:r>
-              <w:rPr>
-                <w:rFonts w:ascii="Arial" w:cs="Arial" w:eastAsia="Arial" w:hAnsi="Arial"/>
-                <w:b w:val="false"/>
-                <w:bCs w:val="false"/>
-                <w:sz w:val="18"/>
-                <w:szCs w:val="18"/>
-              </w:rPr>
-              <w:t xml:space="preserve">3</w:t>
-            </w:r>
-          </w:p>
-        </w:tc>
-        <w:tc>
-          <w:tcPr>
-            <w:tcW w:type="dxa" w:w="3000"/>
-            <w:tcBorders>
-              <w:top w:val="single" w:color="BFBFBF" w:sz="4"/>
-              <w:left w:val="single" w:color="BFBFBF" w:sz="4"/>
-              <w:bottom w:val="single" w:color="BFBFBF" w:sz="4"/>
-              <w:right w:val="single" w:color="BFBFBF" w:sz="4"/>
-            </w:tcBorders>
-            <w:tcMar>
-              <w:top w:type="dxa" w:w="50"/>
-              <w:left w:type="dxa" w:w="80"/>
-              <w:bottom w:type="dxa" w:w="50"/>
-              <w:right w:type="dxa" w:w="80"/>
-            </w:tcMar>
-            <w:vAlign w:val="center"/>
-          </w:tcPr>
-          <w:p>
-            <w:pPr>
-              <w:jc w:val="center"/>
-            </w:pPr>
-            <w:r>
-              <w:rPr>
-                <w:rFonts w:ascii="Arial" w:cs="Arial" w:eastAsia="Arial" w:hAnsi="Arial"/>
-                <w:b/>
-                <w:bCs/>
-                <w:sz w:val="18"/>
-                <w:szCs w:val="18"/>
-                <w:highlight w:val="yellow"/>
-              </w:rPr>
-              <w:t xml:space="preserve">[COMPLETAR: ]</w:t>
-            </w:r>
-          </w:p>
-        </w:tc>
-        <w:tc>
-          <w:tcPr>
-            <w:tcW w:type="dxa" w:w="2160"/>
-            <w:tcBorders>
-              <w:top w:val="single" w:color="BFBFBF" w:sz="4"/>
-              <w:left w:val="single" w:color="BFBFBF" w:sz="4"/>
-              <w:bottom w:val="single" w:color="BFBFBF" w:sz="4"/>
-              <w:right w:val="single" w:color="BFBFBF" w:sz="4"/>
-            </w:tcBorders>
-            <w:tcMar>
-              <w:top w:type="dxa" w:w="50"/>
-              <w:left w:type="dxa" w:w="80"/>
-              <w:bottom w:type="dxa" w:w="50"/>
-              <w:right w:type="dxa" w:w="80"/>
-            </w:tcMar>
-            <w:vAlign w:val="center"/>
-          </w:tcPr>
-          <w:p>
-            <w:pPr>
-              <w:jc w:val="center"/>
-            </w:pPr>
-            <w:r>
-              <w:rPr>
-                <w:rFonts w:ascii="Arial" w:cs="Arial" w:eastAsia="Arial" w:hAnsi="Arial"/>
-                <w:b/>
-                <w:bCs/>
-                <w:sz w:val="18"/>
-                <w:szCs w:val="18"/>
-                <w:highlight w:val="yellow"/>
-              </w:rPr>
-              <w:t xml:space="preserve">[COMPLETAR: ]</w:t>
-            </w:r>
-          </w:p>
-        </w:tc>
-        <w:tc>
-          <w:tcPr>
-            <w:tcW w:type="dxa" w:w="2500"/>
-            <w:tcBorders>
-              <w:top w:val="single" w:color="BFBFBF" w:sz="4"/>
-              <w:left w:val="single" w:color="BFBFBF" w:sz="4"/>
-              <w:bottom w:val="single" w:color="BFBFBF" w:sz="4"/>
-              <w:right w:val="single" w:color="BFBFBF" w:sz="4"/>
-            </w:tcBorders>
-            <w:tcMar>
-              <w:top w:type="dxa" w:w="50"/>
-              <w:left w:type="dxa" w:w="80"/>
-              <w:bottom w:type="dxa" w:w="50"/>
-              <w:right w:type="dxa" w:w="80"/>
-            </w:tcMar>
-            <w:vAlign w:val="center"/>
-          </w:tcPr>
-          <w:p>
-            <w:pPr>
-              <w:jc w:val="center"/>
-            </w:pPr>
-            <w:r>
-              <w:rPr>
-                <w:rFonts w:ascii="Arial" w:cs="Arial" w:eastAsia="Arial" w:hAnsi="Arial"/>
-                <w:b/>
-                <w:bCs/>
-                <w:sz w:val="18"/>
-                <w:szCs w:val="18"/>
-                <w:highlight w:val="yellow"/>
-              </w:rPr>
-              <w:t xml:space="preserve">[COMPLETAR: ]</w:t>
-            </w:r>
-          </w:p>
-        </w:tc>
-      </w:tr>
-      <w:tr>
-        <w:tc>
-          <w:tcPr>
-            <w:tcW w:type="dxa" w:w="1700"/>
-            <w:tcBorders>
-              <w:top w:val="single" w:color="BFBFBF" w:sz="4"/>
-              <w:left w:val="single" w:color="BFBFBF" w:sz="4"/>
-              <w:bottom w:val="single" w:color="BFBFBF" w:sz="4"/>
-              <w:right w:val="single" w:color="BFBFBF" w:sz="4"/>
-            </w:tcBorders>
-            <w:tcMar>
-              <w:top w:type="dxa" w:w="50"/>
-              <w:left w:type="dxa" w:w="80"/>
-              <w:bottom w:type="dxa" w:w="50"/>
-              <w:right w:type="dxa" w:w="80"/>
-            </w:tcMar>
-            <w:vAlign w:val="center"/>
-          </w:tcPr>
-          <w:p>
-            <w:pPr>
-              <w:jc w:val="center"/>
-            </w:pPr>
-            <w:r>
-              <w:rPr>
-                <w:rFonts w:ascii="Arial" w:cs="Arial" w:eastAsia="Arial" w:hAnsi="Arial"/>
-                <w:b w:val="false"/>
-                <w:bCs w:val="false"/>
-                <w:sz w:val="18"/>
-                <w:szCs w:val="18"/>
-              </w:rPr>
-              <w:t xml:space="preserve">Promedio ± U₉₅</w:t>
-            </w:r>
-          </w:p>
-        </w:tc>
-        <w:tc>
-          <w:tcPr>
-            <w:tcW w:type="dxa" w:w="3000"/>
-            <w:tcBorders>
-              <w:top w:val="single" w:color="BFBFBF" w:sz="4"/>
-              <w:left w:val="single" w:color="BFBFBF" w:sz="4"/>
-              <w:bottom w:val="single" w:color="BFBFBF" w:sz="4"/>
-              <w:right w:val="single" w:color="BFBFBF" w:sz="4"/>
-            </w:tcBorders>
-            <w:tcMar>
-              <w:top w:type="dxa" w:w="50"/>
-              <w:left w:type="dxa" w:w="80"/>
-              <w:bottom w:type="dxa" w:w="50"/>
-              <w:right w:type="dxa" w:w="80"/>
-            </w:tcMar>
-            <w:vAlign w:val="center"/>
-          </w:tcPr>
-          <w:p>
-            <w:pPr>
-              <w:jc w:val="center"/>
-            </w:pPr>
-            <w:r>
-              <w:rPr>
-                <w:rFonts w:ascii="Arial" w:cs="Arial" w:eastAsia="Arial" w:hAnsi="Arial"/>
-                <w:b/>
-                <w:bCs/>
-                <w:sz w:val="18"/>
-                <w:szCs w:val="18"/>
-                <w:highlight w:val="yellow"/>
-              </w:rPr>
-              <w:t xml:space="preserve">[COMPLETAR: ]</w:t>
-            </w:r>
-          </w:p>
-        </w:tc>
-        <w:tc>
-          <w:tcPr>
-            <w:tcW w:type="dxa" w:w="2160"/>
-            <w:tcBorders>
-              <w:top w:val="single" w:color="BFBFBF" w:sz="4"/>
-              <w:left w:val="single" w:color="BFBFBF" w:sz="4"/>
-              <w:bottom w:val="single" w:color="BFBFBF" w:sz="4"/>
-              <w:right w:val="single" w:color="BFBFBF" w:sz="4"/>
-            </w:tcBorders>
-            <w:tcMar>
-              <w:top w:type="dxa" w:w="50"/>
-              <w:left w:type="dxa" w:w="80"/>
-              <w:bottom w:type="dxa" w:w="50"/>
-              <w:right w:type="dxa" w:w="80"/>
-            </w:tcMar>
-            <w:vAlign w:val="center"/>
-          </w:tcPr>
-          <w:p>
-            <w:pPr>
-              <w:jc w:val="center"/>
-            </w:pPr>
-            <w:r>
-              <w:rPr>
-                <w:rFonts w:ascii="Arial" w:cs="Arial" w:eastAsia="Arial" w:hAnsi="Arial"/>
-                <w:b w:val="false"/>
-                <w:bCs w:val="false"/>
-                <w:sz w:val="18"/>
-                <w:szCs w:val="18"/>
-              </w:rPr>
-              <w:t xml:space="preserve"/>
-            </w:r>
-          </w:p>
-        </w:tc>
-        <w:tc>
-          <w:tcPr>
-            <w:tcW w:type="dxa" w:w="2500"/>
-            <w:tcBorders>
-              <w:top w:val="single" w:color="BFBFBF" w:sz="4"/>
-              <w:left w:val="single" w:color="BFBFBF" w:sz="4"/>
-              <w:bottom w:val="single" w:color="BFBFBF" w:sz="4"/>
-              <w:right w:val="single" w:color="BFBFBF" w:sz="4"/>
-            </w:tcBorders>
-            <w:tcMar>
-              <w:top w:type="dxa" w:w="50"/>
-              <w:left w:type="dxa" w:w="80"/>
-              <w:bottom w:type="dxa" w:w="50"/>
-              <w:right w:type="dxa" w:w="80"/>
-            </w:tcMar>
-            <w:vAlign w:val="center"/>
-          </w:tcPr>
-          <w:p>
-            <w:pPr>
-              <w:jc w:val="center"/>
-            </w:pPr>
-            <w:r>
-              <w:rPr>
-                <w:rFonts w:ascii="Arial" w:cs="Arial" w:eastAsia="Arial" w:hAnsi="Arial"/>
-                <w:b w:val="false"/>
-                <w:bCs w:val="false"/>
-                <w:sz w:val="18"/>
-                <w:szCs w:val="18"/>
-              </w:rPr>
-              <w:t xml:space="preserve"/>
+              </w:rPr>
+              <w:t xml:space="preserve">43.42 ± 1.03</w:t>
+            </w:r>
+          </w:p>
+        </w:tc>
+        <w:tc>
+          <w:tcPr>
+            <w:tcW w:type="dxa" w:w="1800"/>
+            <w:tcBorders>
+              <w:top w:val="single" w:color="BFBFBF" w:sz="4"/>
+              <w:left w:val="single" w:color="BFBFBF" w:sz="4"/>
+              <w:bottom w:val="single" w:color="BFBFBF" w:sz="4"/>
+              <w:right w:val="single" w:color="BFBFBF" w:sz="4"/>
+            </w:tcBorders>
+            <w:tcMar>
+              <w:top w:type="dxa" w:w="50"/>
+              <w:left w:type="dxa" w:w="80"/>
+              <w:bottom w:type="dxa" w:w="50"/>
+              <w:right w:type="dxa" w:w="80"/>
+            </w:tcMar>
+            <w:vAlign w:val="center"/>
+          </w:tcPr>
+          <w:p>
+            <w:pPr>
+              <w:jc w:val="center"/>
+            </w:pPr>
+            <w:r>
+              <w:rPr>
+                <w:rFonts w:ascii="Arial" w:cs="Arial" w:eastAsia="Arial" w:hAnsi="Arial"/>
+                <w:b w:val="false"/>
+                <w:bCs w:val="false"/>
+                <w:sz w:val="18"/>
+                <w:szCs w:val="18"/>
+              </w:rPr>
+              <w:t xml:space="preserve">t = 3.182</w:t>
             </w:r>
           </w:p>
         </w:tc>
@@ -4605,7 +5239,7 @@
           <w:sz w:val="22"/>
           <w:szCs w:val="22"/>
         </w:rPr>
-        <w:t xml:space="preserve">Referencia: </w:t>
+        <w:t xml:space="preserve">Cálculo de la dispersión. </w:t>
       </w:r>
       <w:r>
         <w:rPr>
@@ -4613,7 +5247,40 @@
           <w:sz w:val="22"/>
           <w:szCs w:val="22"/>
         </w:rPr>
-        <w:t xml:space="preserve">el análisis cuadro por cuadro del video del modelo funcionando (sección 9.3) dio 43.42 ± 1.03 rpm (U₉₅) en cuatro vueltas completas, medidas con el mismo motor y con carga.</w:t>
+        <w:t xml:space="preserve">Promedio: n̄ = (43.78 + 43.11 + 44.10 + 42.67) / 4 = 43.416 rpm. Desviación estándar muestral: s = √[Σ(nᵢ − n̄)² / (N − 1)] = 0.649 rpm, coeficiente de variación s/n̄ = 1.49 %. Incertidumbre del promedio al 95 % con t de Student para N − 1 = 3 grados de libertad: U₉₅ = t·s/√N = 3.182 × 0.649 / √4 = 1.032 rpm.</w:t>
+      </w:r>
+    </w:p>
+    <w:p>
+      <w:pPr>
+        <w:tabs>
+          <w:tab w:val="right" w:pos="9360"/>
+        </w:tabs>
+        <w:spacing w:after="100" w:before="60"/>
+        <w:jc w:val="center"/>
+      </w:pPr>
+      <w:r>
+        <w:rPr>
+          <w:rFonts w:ascii="Cambria Math" w:cs="Cambria Math" w:eastAsia="Cambria Math" w:hAnsi="Cambria Math"/>
+          <w:i w:val="false"/>
+          <w:iCs w:val="false"/>
+          <w:sz w:val="22"/>
+          <w:szCs w:val="22"/>
+        </w:rPr>
+        <w:t xml:space="preserve">n = 43.42 ± 1.03 rpm  (95 %)     →     ω₂ = 2π·n/60 = 4.546 ± 0.108 rad/s</w:t>
+      </w:r>
+    </w:p>
+    <w:p>
+      <w:pPr>
+        <w:spacing w:after="120" w:line="276"/>
+        <w:jc w:val="both"/>
+      </w:pPr>
+      <w:r>
+        <w:rPr>
+          <w:rFonts w:ascii="Arial" w:cs="Arial" w:eastAsia="Arial" w:hAnsi="Arial"/>
+          <w:sz w:val="22"/>
+          <w:szCs w:val="22"/>
+        </w:rPr>
+        <w:t xml:space="preserve">La dispersión entre vueltas es pequeña (CV de 1.5 %): el motor mantiene su velocidad media de una vuelta a otra. Sin embargo, esa velocidad es 45 % mayor que los 30 rpm usados en los cálculos; esta diferencia se analiza en el inciso g (sección 9). Como verificación independiente, el seguimiento manual del grupo en Tracker dio 45.5 rpm en un tramo de menos de media vuelta.</w:t>
       </w:r>
     </w:p>
     <w:p>

</xml_diff>